<commit_message>
refactor: uniformly formatted code, small changes to readme and raport
</commit_message>
<xml_diff>
--- a/doc/raport.docx
+++ b/doc/raport.docx
@@ -66,7 +66,7 @@
       </w:r>
       <w:r>
         <w:rPr/>
-        <w:t>31.08.2026</w:t>
+        <w:t>01.09.2026</w:t>
       </w:r>
       <w:r>
         <w:rPr/>
@@ -1327,7 +1327,7 @@
       </w:pPr>
       <w:r>
         <w:rPr/>
-        <w:t>Osoba odpowiedzialna: JK</w:t>
+        <w:t xml:space="preserve">Osoba odpowiedzialna: </w:t>
       </w:r>
     </w:p>
     <w:p>
@@ -2313,234 +2313,6 @@
           <w:color w:val="CC0000"/>
           <w:sz w:val="20"/>
           <w:szCs w:val="20"/>
-          <w:lang w:val="pl-PL"/>
-        </w:rPr>
-      </w:r>
-    </w:p>
-    <w:p>
-      <w:pPr>
-        <w:pStyle w:val="Standard"/>
-        <w:rPr>
-          <w:rFonts w:ascii="Liberation Sans" w:hAnsi="Liberation Sans" w:eastAsia="Liberation Sans" w:hint="eastAsia"/>
-          <w:b w:val="false"/>
-          <w:bCs w:val="false"/>
-          <w:i w:val="false"/>
-          <w:iCs w:val="false"/>
-          <w:color w:val="000000"/>
-          <w:sz w:val="22"/>
-          <w:szCs w:val="22"/>
-          <w:lang w:val="pl-PL"/>
-        </w:rPr>
-      </w:pPr>
-      <w:r>
-        <w:rPr>
-          <w:rFonts w:eastAsia="Liberation Sans" w:hint="eastAsia" w:ascii="Liberation Sans" w:hAnsi="Liberation Sans"/>
-          <w:b w:val="false"/>
-          <w:bCs w:val="false"/>
-          <w:i w:val="false"/>
-          <w:iCs w:val="false"/>
-          <w:color w:val="000000"/>
-          <w:sz w:val="22"/>
-          <w:szCs w:val="22"/>
-          <w:lang w:val="pl-PL"/>
-        </w:rPr>
-        <w:t>b) low_res_if – Używana wewnętrzenie przeskalowana w dół rozdzielczość 256x192</w:t>
-      </w:r>
-    </w:p>
-    <w:tbl>
-      <w:tblPr>
-        <w:tblW w:w="9638" w:type="dxa"/>
-        <w:jc w:val="start"/>
-        <w:tblInd w:w="0" w:type="dxa"/>
-        <w:tblLayout w:type="fixed"/>
-        <w:tblCellMar>
-          <w:top w:w="55" w:type="dxa"/>
-          <w:start w:w="55" w:type="dxa"/>
-          <w:bottom w:w="55" w:type="dxa"/>
-          <w:end w:w="55" w:type="dxa"/>
-        </w:tblCellMar>
-        <w:tblLook w:val="04a0" w:noHBand="0" w:noVBand="1" w:firstColumn="1" w:lastRow="0" w:lastColumn="0" w:firstRow="1"/>
-      </w:tblPr>
-      <w:tblGrid>
-        <w:gridCol w:w="2500"/>
-        <w:gridCol w:w="7138"/>
-      </w:tblGrid>
-      <w:tr>
-        <w:trPr/>
-        <w:tc>
-          <w:tcPr>
-            <w:tcW w:w="2500" w:type="dxa"/>
-            <w:tcBorders>
-              <w:top w:val="single" w:sz="2" w:space="0" w:color="000000"/>
-              <w:start w:val="single" w:sz="2" w:space="0" w:color="000000"/>
-              <w:bottom w:val="single" w:sz="2" w:space="0" w:color="000000"/>
-            </w:tcBorders>
-            <w:shd w:color="auto" w:fill="auto" w:val="clear"/>
-          </w:tcPr>
-          <w:p>
-            <w:pPr>
-              <w:pStyle w:val="TableContents"/>
-              <w:jc w:val="center"/>
-              <w:rPr>
-                <w:b/>
-                <w:bCs/>
-              </w:rPr>
-            </w:pPr>
-            <w:r>
-              <w:rPr>
-                <w:b/>
-                <w:bCs/>
-              </w:rPr>
-              <w:t>nazwa sygnału</w:t>
-            </w:r>
-          </w:p>
-        </w:tc>
-        <w:tc>
-          <w:tcPr>
-            <w:tcW w:w="7138" w:type="dxa"/>
-            <w:tcBorders>
-              <w:top w:val="single" w:sz="2" w:space="0" w:color="000000"/>
-              <w:start w:val="single" w:sz="2" w:space="0" w:color="000000"/>
-              <w:bottom w:val="single" w:sz="2" w:space="0" w:color="000000"/>
-              <w:end w:val="single" w:sz="2" w:space="0" w:color="000000"/>
-            </w:tcBorders>
-            <w:shd w:color="auto" w:fill="auto" w:val="clear"/>
-          </w:tcPr>
-          <w:p>
-            <w:pPr>
-              <w:pStyle w:val="TableContents"/>
-              <w:jc w:val="center"/>
-              <w:rPr>
-                <w:b/>
-                <w:bCs/>
-              </w:rPr>
-            </w:pPr>
-            <w:r>
-              <w:rPr>
-                <w:b/>
-                <w:bCs/>
-              </w:rPr>
-              <w:t>opis</w:t>
-            </w:r>
-          </w:p>
-        </w:tc>
-      </w:tr>
-      <w:tr>
-        <w:trPr/>
-        <w:tc>
-          <w:tcPr>
-            <w:tcW w:w="2500" w:type="dxa"/>
-            <w:tcBorders>
-              <w:start w:val="single" w:sz="2" w:space="0" w:color="000000"/>
-              <w:bottom w:val="single" w:sz="2" w:space="0" w:color="000000"/>
-            </w:tcBorders>
-            <w:shd w:color="auto" w:fill="auto" w:val="clear"/>
-          </w:tcPr>
-          <w:p>
-            <w:pPr>
-              <w:pStyle w:val="TableContents"/>
-              <w:jc w:val="center"/>
-              <w:rPr/>
-            </w:pPr>
-            <w:r>
-              <w:rPr/>
-              <w:t>vcount[7:0]</w:t>
-            </w:r>
-          </w:p>
-        </w:tc>
-        <w:tc>
-          <w:tcPr>
-            <w:tcW w:w="7138" w:type="dxa"/>
-            <w:tcBorders>
-              <w:start w:val="single" w:sz="2" w:space="0" w:color="000000"/>
-              <w:bottom w:val="single" w:sz="2" w:space="0" w:color="000000"/>
-              <w:end w:val="single" w:sz="2" w:space="0" w:color="000000"/>
-            </w:tcBorders>
-            <w:shd w:color="auto" w:fill="auto" w:val="clear"/>
-          </w:tcPr>
-          <w:p>
-            <w:pPr>
-              <w:pStyle w:val="TableContents"/>
-              <w:rPr/>
-            </w:pPr>
-            <w:r>
-              <w:rPr/>
-              <w:t>Licznik aktualnego wiersza obrazu w downscalowanej wewnętrznej rozdzielczości</w:t>
-            </w:r>
-          </w:p>
-        </w:tc>
-      </w:tr>
-      <w:tr>
-        <w:trPr/>
-        <w:tc>
-          <w:tcPr>
-            <w:tcW w:w="2500" w:type="dxa"/>
-            <w:tcBorders>
-              <w:start w:val="single" w:sz="2" w:space="0" w:color="000000"/>
-              <w:bottom w:val="single" w:sz="2" w:space="0" w:color="000000"/>
-            </w:tcBorders>
-            <w:shd w:color="auto" w:fill="auto" w:val="clear"/>
-          </w:tcPr>
-          <w:p>
-            <w:pPr>
-              <w:pStyle w:val="TableContents"/>
-              <w:jc w:val="center"/>
-              <w:rPr/>
-            </w:pPr>
-            <w:r>
-              <w:rPr/>
-              <w:t>hcount[7:0]</w:t>
-            </w:r>
-          </w:p>
-        </w:tc>
-        <w:tc>
-          <w:tcPr>
-            <w:tcW w:w="7138" w:type="dxa"/>
-            <w:tcBorders>
-              <w:start w:val="single" w:sz="2" w:space="0" w:color="000000"/>
-              <w:bottom w:val="single" w:sz="2" w:space="0" w:color="000000"/>
-              <w:end w:val="single" w:sz="2" w:space="0" w:color="000000"/>
-            </w:tcBorders>
-            <w:shd w:color="auto" w:fill="auto" w:val="clear"/>
-          </w:tcPr>
-          <w:p>
-            <w:pPr>
-              <w:pStyle w:val="TableContents"/>
-              <w:rPr/>
-            </w:pPr>
-            <w:r>
-              <w:rPr/>
-              <w:t>Licznik aktualnej pozycji piksela w wierszu w downscalowanej wewnętrznej rozdzielczości</w:t>
-            </w:r>
-          </w:p>
-        </w:tc>
-      </w:tr>
-    </w:tbl>
-    <w:p>
-      <w:pPr>
-        <w:pStyle w:val="Normal"/>
-        <w:rPr>
-          <w:rFonts w:ascii="Liberation Sans" w:hAnsi="Liberation Sans" w:eastAsia="Liberation Sans" w:hint="eastAsia"/>
-          <w:b w:val="false"/>
-          <w:bCs w:val="false"/>
-          <w:i w:val="false"/>
-          <w:iCs w:val="false"/>
-          <w:color w:val="000000"/>
-          <w:sz w:val="22"/>
-          <w:szCs w:val="22"/>
-          <w:lang w:val="pl-PL"/>
-        </w:rPr>
-      </w:pPr>
-      <w:r>
-        <w:rPr>
-          <w:rFonts w:eastAsia="Liberation Sans" w:hint="eastAsia" w:ascii="Liberation Sans" w:hAnsi="Liberation Sans"/>
-          <w:b w:val="false"/>
-          <w:bCs w:val="false"/>
-          <w:i w:val="false"/>
-          <w:iCs w:val="false"/>
-          <w:color w:val="000000"/>
-          <w:sz w:val="22"/>
-          <w:szCs w:val="22"/>
           <w:lang w:val="pl-PL"/>
         </w:rPr>
       </w:r>
@@ -3772,9 +3544,9 @@
         </w:tblCellMar>
       </w:tblPr>
       <w:tblGrid>
-        <w:gridCol w:w="2279"/>
+        <w:gridCol w:w="2277"/>
         <w:gridCol w:w="1620"/>
-        <w:gridCol w:w="1620"/>
+        <w:gridCol w:w="1622"/>
         <w:gridCol w:w="1981"/>
         <w:gridCol w:w="2070"/>
       </w:tblGrid>
@@ -3784,7 +3556,7 @@
         </w:trPr>
         <w:tc>
           <w:tcPr>
-            <w:tcW w:w="2279" w:type="dxa"/>
+            <w:tcW w:w="2277" w:type="dxa"/>
             <w:tcBorders/>
             <w:vAlign w:val="center"/>
           </w:tcPr>
@@ -3835,13 +3607,116 @@
         </w:tc>
         <w:tc>
           <w:tcPr>
+            <w:tcW w:w="1622" w:type="dxa"/>
+            <w:tcBorders/>
+            <w:vAlign w:val="center"/>
+          </w:tcPr>
+          <w:p>
+            <w:pPr>
+              <w:pStyle w:val="TableHeading"/>
+              <w:jc w:val="end"/>
+              <w:rPr>
+                <w:rFonts w:ascii="Liberation Sans" w:hAnsi="Liberation Sans"/>
+                <w:b w:val="false"/>
+                <w:bCs w:val="false"/>
+              </w:rPr>
+            </w:pPr>
+            <w:r>
+              <w:rPr>
+                <w:rFonts w:ascii="Liberation Sans" w:hAnsi="Liberation Sans"/>
+                <w:b w:val="false"/>
+                <w:bCs w:val="false"/>
+              </w:rPr>
+              <w:t>Total slack [ns]</w:t>
+            </w:r>
+          </w:p>
+        </w:tc>
+        <w:tc>
+          <w:tcPr>
+            <w:tcW w:w="1981" w:type="dxa"/>
+            <w:tcBorders/>
+            <w:vAlign w:val="center"/>
+          </w:tcPr>
+          <w:p>
+            <w:pPr>
+              <w:pStyle w:val="TableHeading"/>
+              <w:jc w:val="end"/>
+              <w:rPr>
+                <w:rFonts w:ascii="Liberation Sans" w:hAnsi="Liberation Sans"/>
+                <w:b w:val="false"/>
+                <w:bCs w:val="false"/>
+              </w:rPr>
+            </w:pPr>
+            <w:r>
+              <w:rPr>
+                <w:rFonts w:ascii="Liberation Sans" w:hAnsi="Liberation Sans"/>
+                <w:b w:val="false"/>
+                <w:bCs w:val="false"/>
+              </w:rPr>
+              <w:t>Naruszone punkty</w:t>
+            </w:r>
+          </w:p>
+        </w:tc>
+        <w:tc>
+          <w:tcPr>
+            <w:tcW w:w="2070" w:type="dxa"/>
+            <w:tcBorders/>
+            <w:vAlign w:val="center"/>
+          </w:tcPr>
+          <w:p>
+            <w:pPr>
+              <w:pStyle w:val="TableHeading"/>
+              <w:jc w:val="end"/>
+              <w:rPr>
+                <w:rFonts w:ascii="Liberation Sans" w:hAnsi="Liberation Sans"/>
+                <w:b w:val="false"/>
+                <w:bCs w:val="false"/>
+              </w:rPr>
+            </w:pPr>
+            <w:r>
+              <w:rPr>
+                <w:rFonts w:ascii="Liberation Sans" w:hAnsi="Liberation Sans"/>
+                <w:b w:val="false"/>
+                <w:bCs w:val="false"/>
+              </w:rPr>
+              <w:t>Wszystkie punkty</w:t>
+            </w:r>
+          </w:p>
+        </w:tc>
+      </w:tr>
+      <w:tr>
+        <w:trPr/>
+        <w:tc>
+          <w:tcPr>
+            <w:tcW w:w="2277" w:type="dxa"/>
+            <w:tcBorders/>
+            <w:vAlign w:val="center"/>
+          </w:tcPr>
+          <w:p>
+            <w:pPr>
+              <w:pStyle w:val="TableContents"/>
+              <w:rPr/>
+            </w:pPr>
+            <w:r>
+              <w:rPr>
+                <w:rStyle w:val="Strong"/>
+                <w:rFonts w:ascii="Liberation Sans" w:hAnsi="Liberation Sans"/>
+                <w:b w:val="false"/>
+                <w:bCs w:val="false"/>
+              </w:rPr>
+              <w:t>Setup WNS</w:t>
+            </w:r>
+          </w:p>
+        </w:tc>
+        <w:tc>
+          <w:tcPr>
             <w:tcW w:w="1620" w:type="dxa"/>
             <w:tcBorders/>
             <w:vAlign w:val="center"/>
           </w:tcPr>
           <w:p>
             <w:pPr>
-              <w:pStyle w:val="TableHeading"/>
+              <w:pStyle w:val="TableContents"/>
               <w:jc w:val="end"/>
               <w:rPr>
                 <w:rFonts w:ascii="Liberation Sans" w:hAnsi="Liberation Sans"/>
@@ -3855,7 +3730,33 @@
                 <w:b w:val="false"/>
                 <w:bCs w:val="false"/>
               </w:rPr>
-              <w:t>Total slack [ns]</w:t>
+              <w:t>1.122</w:t>
+            </w:r>
+          </w:p>
+        </w:tc>
+        <w:tc>
+          <w:tcPr>
+            <w:tcW w:w="1622" w:type="dxa"/>
+            <w:tcBorders/>
+            <w:vAlign w:val="center"/>
+          </w:tcPr>
+          <w:p>
+            <w:pPr>
+              <w:pStyle w:val="TableContents"/>
+              <w:jc w:val="end"/>
+              <w:rPr>
+                <w:rFonts w:ascii="Liberation Sans" w:hAnsi="Liberation Sans"/>
+                <w:b w:val="false"/>
+                <w:bCs w:val="false"/>
+              </w:rPr>
+            </w:pPr>
+            <w:r>
+              <w:rPr>
+                <w:rFonts w:ascii="Liberation Sans" w:hAnsi="Liberation Sans"/>
+                <w:b w:val="false"/>
+                <w:bCs w:val="false"/>
+              </w:rPr>
+              <w:t>0</w:t>
             </w:r>
           </w:p>
         </w:tc>
@@ -3867,7 +3768,7 @@
           </w:tcPr>
           <w:p>
             <w:pPr>
-              <w:pStyle w:val="TableHeading"/>
+              <w:pStyle w:val="TableContents"/>
               <w:jc w:val="end"/>
               <w:rPr>
                 <w:rFonts w:ascii="Liberation Sans" w:hAnsi="Liberation Sans"/>
@@ -3881,7 +3782,7 @@
                 <w:b w:val="false"/>
                 <w:bCs w:val="false"/>
               </w:rPr>
-              <w:t>Naruszone punkty</w:t>
+              <w:t>0</w:t>
             </w:r>
           </w:p>
         </w:tc>
@@ -3893,7 +3794,7 @@
           </w:tcPr>
           <w:p>
             <w:pPr>
-              <w:pStyle w:val="TableHeading"/>
+              <w:pStyle w:val="TableContents"/>
               <w:jc w:val="end"/>
               <w:rPr>
                 <w:rFonts w:ascii="Liberation Sans" w:hAnsi="Liberation Sans"/>
@@ -3907,7 +3808,7 @@
                 <w:b w:val="false"/>
                 <w:bCs w:val="false"/>
               </w:rPr>
-              <w:t>Wszystkie punkty</w:t>
+              <w:t>3650</w:t>
             </w:r>
           </w:p>
         </w:tc>
@@ -3916,7 +3817,7 @@
         <w:trPr/>
         <w:tc>
           <w:tcPr>
-            <w:tcW w:w="2279" w:type="dxa"/>
+            <w:tcW w:w="2277" w:type="dxa"/>
             <w:tcBorders/>
             <w:vAlign w:val="center"/>
           </w:tcPr>
@@ -3932,7 +3833,7 @@
                 <w:b w:val="false"/>
                 <w:bCs w:val="false"/>
               </w:rPr>
-              <w:t>Setup WNS</w:t>
+              <w:t>Hold WHS</w:t>
             </w:r>
           </w:p>
         </w:tc>
@@ -3958,7 +3859,110 @@
                 <w:b w:val="false"/>
                 <w:bCs w:val="false"/>
               </w:rPr>
-              <w:t>1.122</w:t>
+              <w:t>0.033</w:t>
+            </w:r>
+          </w:p>
+        </w:tc>
+        <w:tc>
+          <w:tcPr>
+            <w:tcW w:w="1622" w:type="dxa"/>
+            <w:tcBorders/>
+            <w:vAlign w:val="center"/>
+          </w:tcPr>
+          <w:p>
+            <w:pPr>
+              <w:pStyle w:val="TableContents"/>
+              <w:jc w:val="end"/>
+              <w:rPr>
+                <w:rFonts w:ascii="Liberation Sans" w:hAnsi="Liberation Sans"/>
+                <w:b w:val="false"/>
+                <w:bCs w:val="false"/>
+              </w:rPr>
+            </w:pPr>
+            <w:r>
+              <w:rPr>
+                <w:rFonts w:ascii="Liberation Sans" w:hAnsi="Liberation Sans"/>
+                <w:b w:val="false"/>
+                <w:bCs w:val="false"/>
+              </w:rPr>
+              <w:t>0</w:t>
+            </w:r>
+          </w:p>
+        </w:tc>
+        <w:tc>
+          <w:tcPr>
+            <w:tcW w:w="1981" w:type="dxa"/>
+            <w:tcBorders/>
+            <w:vAlign w:val="center"/>
+          </w:tcPr>
+          <w:p>
+            <w:pPr>
+              <w:pStyle w:val="TableContents"/>
+              <w:jc w:val="end"/>
+              <w:rPr>
+                <w:rFonts w:ascii="Liberation Sans" w:hAnsi="Liberation Sans"/>
+                <w:b w:val="false"/>
+                <w:bCs w:val="false"/>
+              </w:rPr>
+            </w:pPr>
+            <w:r>
+              <w:rPr>
+                <w:rFonts w:ascii="Liberation Sans" w:hAnsi="Liberation Sans"/>
+                <w:b w:val="false"/>
+                <w:bCs w:val="false"/>
+              </w:rPr>
+              <w:t>0</w:t>
+            </w:r>
+          </w:p>
+        </w:tc>
+        <w:tc>
+          <w:tcPr>
+            <w:tcW w:w="2070" w:type="dxa"/>
+            <w:tcBorders/>
+            <w:vAlign w:val="center"/>
+          </w:tcPr>
+          <w:p>
+            <w:pPr>
+              <w:pStyle w:val="TableContents"/>
+              <w:jc w:val="end"/>
+              <w:rPr>
+                <w:rFonts w:ascii="Liberation Sans" w:hAnsi="Liberation Sans"/>
+                <w:b w:val="false"/>
+                <w:bCs w:val="false"/>
+              </w:rPr>
+            </w:pPr>
+            <w:r>
+              <w:rPr>
+                <w:rFonts w:ascii="Liberation Sans" w:hAnsi="Liberation Sans"/>
+                <w:b w:val="false"/>
+                <w:bCs w:val="false"/>
+              </w:rPr>
+              <w:t>3650</w:t>
+            </w:r>
+          </w:p>
+        </w:tc>
+      </w:tr>
+      <w:tr>
+        <w:trPr/>
+        <w:tc>
+          <w:tcPr>
+            <w:tcW w:w="2277" w:type="dxa"/>
+            <w:tcBorders/>
+            <w:vAlign w:val="center"/>
+          </w:tcPr>
+          <w:p>
+            <w:pPr>
+              <w:pStyle w:val="TableContents"/>
+              <w:rPr/>
+            </w:pPr>
+            <w:r>
+              <w:rPr>
+                <w:rStyle w:val="Strong"/>
+                <w:rFonts w:ascii="Liberation Sans" w:hAnsi="Liberation Sans"/>
+                <w:b w:val="false"/>
+                <w:bCs w:val="false"/>
+              </w:rPr>
+              <w:t>Pulse width WPWS</w:t>
             </w:r>
           </w:p>
         </w:tc>
@@ -3984,245 +3988,13 @@
                 <w:b w:val="false"/>
                 <w:bCs w:val="false"/>
               </w:rPr>
-              <w:t>0</w:t>
-            </w:r>
-          </w:p>
-        </w:tc>
-        <w:tc>
-          <w:tcPr>
-            <w:tcW w:w="1981" w:type="dxa"/>
-            <w:tcBorders/>
-            <w:vAlign w:val="center"/>
-          </w:tcPr>
-          <w:p>
-            <w:pPr>
-              <w:pStyle w:val="TableContents"/>
-              <w:jc w:val="end"/>
-              <w:rPr>
-                <w:rFonts w:ascii="Liberation Sans" w:hAnsi="Liberation Sans"/>
-                <w:b w:val="false"/>
-                <w:bCs w:val="false"/>
-              </w:rPr>
-            </w:pPr>
-            <w:r>
-              <w:rPr>
-                <w:rFonts w:ascii="Liberation Sans" w:hAnsi="Liberation Sans"/>
-                <w:b w:val="false"/>
-                <w:bCs w:val="false"/>
-              </w:rPr>
-              <w:t>0</w:t>
-            </w:r>
-          </w:p>
-        </w:tc>
-        <w:tc>
-          <w:tcPr>
-            <w:tcW w:w="2070" w:type="dxa"/>
-            <w:tcBorders/>
-            <w:vAlign w:val="center"/>
-          </w:tcPr>
-          <w:p>
-            <w:pPr>
-              <w:pStyle w:val="TableContents"/>
-              <w:jc w:val="end"/>
-              <w:rPr>
-                <w:rFonts w:ascii="Liberation Sans" w:hAnsi="Liberation Sans"/>
-                <w:b w:val="false"/>
-                <w:bCs w:val="false"/>
-              </w:rPr>
-            </w:pPr>
-            <w:r>
-              <w:rPr>
-                <w:rFonts w:ascii="Liberation Sans" w:hAnsi="Liberation Sans"/>
-                <w:b w:val="false"/>
-                <w:bCs w:val="false"/>
-              </w:rPr>
-              <w:t>3650</w:t>
-            </w:r>
-          </w:p>
-        </w:tc>
-      </w:tr>
-      <w:tr>
-        <w:trPr/>
-        <w:tc>
-          <w:tcPr>
-            <w:tcW w:w="2279" w:type="dxa"/>
-            <w:tcBorders/>
-            <w:vAlign w:val="center"/>
-          </w:tcPr>
-          <w:p>
-            <w:pPr>
-              <w:pStyle w:val="TableContents"/>
-              <w:rPr/>
-            </w:pPr>
-            <w:r>
-              <w:rPr>
-                <w:rStyle w:val="Strong"/>
-                <w:rFonts w:ascii="Liberation Sans" w:hAnsi="Liberation Sans"/>
-                <w:b w:val="false"/>
-                <w:bCs w:val="false"/>
-              </w:rPr>
-              <w:t>Hold WHS</w:t>
-            </w:r>
-          </w:p>
-        </w:tc>
-        <w:tc>
-          <w:tcPr>
-            <w:tcW w:w="1620" w:type="dxa"/>
-            <w:tcBorders/>
-            <w:vAlign w:val="center"/>
-          </w:tcPr>
-          <w:p>
-            <w:pPr>
-              <w:pStyle w:val="TableContents"/>
-              <w:jc w:val="end"/>
-              <w:rPr>
-                <w:rFonts w:ascii="Liberation Sans" w:hAnsi="Liberation Sans"/>
-                <w:b w:val="false"/>
-                <w:bCs w:val="false"/>
-              </w:rPr>
-            </w:pPr>
-            <w:r>
-              <w:rPr>
-                <w:rFonts w:ascii="Liberation Sans" w:hAnsi="Liberation Sans"/>
-                <w:b w:val="false"/>
-                <w:bCs w:val="false"/>
-              </w:rPr>
-              <w:t>0.033</w:t>
-            </w:r>
-          </w:p>
-        </w:tc>
-        <w:tc>
-          <w:tcPr>
-            <w:tcW w:w="1620" w:type="dxa"/>
-            <w:tcBorders/>
-            <w:vAlign w:val="center"/>
-          </w:tcPr>
-          <w:p>
-            <w:pPr>
-              <w:pStyle w:val="TableContents"/>
-              <w:jc w:val="end"/>
-              <w:rPr>
-                <w:rFonts w:ascii="Liberation Sans" w:hAnsi="Liberation Sans"/>
-                <w:b w:val="false"/>
-                <w:bCs w:val="false"/>
-              </w:rPr>
-            </w:pPr>
-            <w:r>
-              <w:rPr>
-                <w:rFonts w:ascii="Liberation Sans" w:hAnsi="Liberation Sans"/>
-                <w:b w:val="false"/>
-                <w:bCs w:val="false"/>
-              </w:rPr>
-              <w:t>0</w:t>
-            </w:r>
-          </w:p>
-        </w:tc>
-        <w:tc>
-          <w:tcPr>
-            <w:tcW w:w="1981" w:type="dxa"/>
-            <w:tcBorders/>
-            <w:vAlign w:val="center"/>
-          </w:tcPr>
-          <w:p>
-            <w:pPr>
-              <w:pStyle w:val="TableContents"/>
-              <w:jc w:val="end"/>
-              <w:rPr>
-                <w:rFonts w:ascii="Liberation Sans" w:hAnsi="Liberation Sans"/>
-                <w:b w:val="false"/>
-                <w:bCs w:val="false"/>
-              </w:rPr>
-            </w:pPr>
-            <w:r>
-              <w:rPr>
-                <w:rFonts w:ascii="Liberation Sans" w:hAnsi="Liberation Sans"/>
-                <w:b w:val="false"/>
-                <w:bCs w:val="false"/>
-              </w:rPr>
-              <w:t>0</w:t>
-            </w:r>
-          </w:p>
-        </w:tc>
-        <w:tc>
-          <w:tcPr>
-            <w:tcW w:w="2070" w:type="dxa"/>
-            <w:tcBorders/>
-            <w:vAlign w:val="center"/>
-          </w:tcPr>
-          <w:p>
-            <w:pPr>
-              <w:pStyle w:val="TableContents"/>
-              <w:jc w:val="end"/>
-              <w:rPr>
-                <w:rFonts w:ascii="Liberation Sans" w:hAnsi="Liberation Sans"/>
-                <w:b w:val="false"/>
-                <w:bCs w:val="false"/>
-              </w:rPr>
-            </w:pPr>
-            <w:r>
-              <w:rPr>
-                <w:rFonts w:ascii="Liberation Sans" w:hAnsi="Liberation Sans"/>
-                <w:b w:val="false"/>
-                <w:bCs w:val="false"/>
-              </w:rPr>
-              <w:t>3650</w:t>
-            </w:r>
-          </w:p>
-        </w:tc>
-      </w:tr>
-      <w:tr>
-        <w:trPr/>
-        <w:tc>
-          <w:tcPr>
-            <w:tcW w:w="2279" w:type="dxa"/>
-            <w:tcBorders/>
-            <w:vAlign w:val="center"/>
-          </w:tcPr>
-          <w:p>
-            <w:pPr>
-              <w:pStyle w:val="TableContents"/>
-              <w:rPr/>
-            </w:pPr>
-            <w:r>
-              <w:rPr>
-                <w:rStyle w:val="Strong"/>
-                <w:rFonts w:ascii="Liberation Sans" w:hAnsi="Liberation Sans"/>
-                <w:b w:val="false"/>
-                <w:bCs w:val="false"/>
-              </w:rPr>
-              <w:t>Pulse width WPWS</w:t>
-            </w:r>
-          </w:p>
-        </w:tc>
-        <w:tc>
-          <w:tcPr>
-            <w:tcW w:w="1620" w:type="dxa"/>
-            <w:tcBorders/>
-            <w:vAlign w:val="center"/>
-          </w:tcPr>
-          <w:p>
-            <w:pPr>
-              <w:pStyle w:val="TableContents"/>
-              <w:jc w:val="end"/>
-              <w:rPr>
-                <w:rFonts w:ascii="Liberation Sans" w:hAnsi="Liberation Sans"/>
-                <w:b w:val="false"/>
-                <w:bCs w:val="false"/>
-              </w:rPr>
-            </w:pPr>
-            <w:r>
-              <w:rPr>
-                <w:rFonts w:ascii="Liberation Sans" w:hAnsi="Liberation Sans"/>
-                <w:b w:val="false"/>
-                <w:bCs w:val="false"/>
-              </w:rPr>
               <w:t>3.000</w:t>
             </w:r>
           </w:p>
         </w:tc>
         <w:tc>
           <w:tcPr>
-            <w:tcW w:w="1620" w:type="dxa"/>
+            <w:tcW w:w="1622" w:type="dxa"/>
             <w:tcBorders/>
             <w:vAlign w:val="center"/>
           </w:tcPr>
@@ -4506,7 +4278,7 @@
     </w:r>
     <w:r>
       <w:rPr/>
-      <w:t>31.08.2026</w:t>
+      <w:t>01.09.2026</w:t>
     </w:r>
     <w:r>
       <w:rPr/>
@@ -4593,7 +4365,7 @@
     </w:r>
     <w:r>
       <w:rPr/>
-      <w:t>31.08.2026</w:t>
+      <w:t>01.09.2026</w:t>
     </w:r>
     <w:r>
       <w:rPr/>

</xml_diff>